<commit_message>
correccion menus horizontales es
</commit_message>
<xml_diff>
--- a/imagenes-foto-gallery-guia-para-agregar.docx
+++ b/imagenes-foto-gallery-guia-para-agregar.docx
@@ -13,18 +13,261 @@
         <w:t>1.</w:t>
       </w:r>
       <w:r>
+        <w:t xml:space="preserve"> PaloSantoSuite-8032 </w:t>
+      </w:r>
+    </w:p>
+    <w:p>
+      <w:r>
+        <w:t>data-tags: habitaciones</w:t>
+      </w:r>
+    </w:p>
+    <w:p>
+      <w:r>
+        <w:t>col-</w:t>
+      </w:r>
+      <w:proofErr w:type="spellStart"/>
+      <w:r>
+        <w:t>span</w:t>
+      </w:r>
+      <w:proofErr w:type="spellEnd"/>
+      <w:r>
+        <w:t>: 1</w:t>
+      </w:r>
+    </w:p>
+    <w:p/>
+    <w:p>
+      <w:r>
+        <w:t>2.</w:t>
+      </w:r>
+      <w:r>
+        <w:t xml:space="preserve"> PaloSanto-Bathrooms-IMG_8147</w:t>
+      </w:r>
+    </w:p>
+    <w:p>
+      <w:r>
+        <w:t>data-tags: habitaciones</w:t>
+      </w:r>
+    </w:p>
+    <w:p>
+      <w:r>
+        <w:t>col-</w:t>
+      </w:r>
+      <w:proofErr w:type="spellStart"/>
+      <w:r>
+        <w:t>span</w:t>
+      </w:r>
+      <w:proofErr w:type="spellEnd"/>
+      <w:r>
+        <w:t>: 1</w:t>
+      </w:r>
+    </w:p>
+    <w:p/>
+    <w:p/>
+    <w:p>
+      <w:r>
+        <w:t>3.</w:t>
+      </w:r>
+      <w:r>
+        <w:t xml:space="preserve"> PaloSantoSuite-Cama_8119</w:t>
+      </w:r>
+    </w:p>
+    <w:p>
+      <w:r>
+        <w:t>data-tags: habitaciones</w:t>
+      </w:r>
+    </w:p>
+    <w:p>
+      <w:r>
+        <w:t>col-</w:t>
+      </w:r>
+      <w:proofErr w:type="spellStart"/>
+      <w:r>
+        <w:t>span</w:t>
+      </w:r>
+      <w:proofErr w:type="spellEnd"/>
+      <w:r>
+        <w:t>: 1</w:t>
+      </w:r>
+    </w:p>
+    <w:p/>
+    <w:p>
+      <w:r>
+        <w:t>4.</w:t>
+      </w:r>
+      <w:r>
+        <w:t xml:space="preserve"> Suites- </w:t>
+      </w:r>
+      <w:proofErr w:type="spellStart"/>
+      <w:r>
+        <w:t>Bathroom</w:t>
+      </w:r>
+      <w:proofErr w:type="spellEnd"/>
+      <w:r>
+        <w:t xml:space="preserve"> – 8250</w:t>
+      </w:r>
+    </w:p>
+    <w:p>
+      <w:r>
+        <w:t>data-tags: habitaciones</w:t>
+      </w:r>
+    </w:p>
+    <w:p>
+      <w:r>
+        <w:t>col-</w:t>
+      </w:r>
+      <w:proofErr w:type="spellStart"/>
+      <w:r>
+        <w:t>span</w:t>
+      </w:r>
+      <w:proofErr w:type="spellEnd"/>
+      <w:r>
+        <w:t>: 1</w:t>
+      </w:r>
+    </w:p>
+    <w:p/>
+    <w:p>
+      <w:r>
+        <w:t>5.</w:t>
+      </w:r>
+      <w:r>
+        <w:t xml:space="preserve"> Grupo-Jardin-IMG_3054-324-2000</w:t>
+      </w:r>
+    </w:p>
+    <w:p>
+      <w:r>
+        <w:t>data-tags: exteriores, áreas comunes</w:t>
+      </w:r>
+    </w:p>
+    <w:p>
+      <w:r>
+        <w:t>col-</w:t>
+      </w:r>
+      <w:proofErr w:type="spellStart"/>
+      <w:r>
+        <w:t>span</w:t>
+      </w:r>
+      <w:proofErr w:type="spellEnd"/>
+      <w:r>
+        <w:t>: 2</w:t>
+      </w:r>
+    </w:p>
+    <w:p/>
+    <w:p/>
+    <w:p>
+      <w:r>
+        <w:t>Tercera línea</w:t>
+      </w:r>
+    </w:p>
+    <w:p>
+      <w:r>
+        <w:t xml:space="preserve">1. </w:t>
+      </w:r>
+      <w:r>
+        <w:t>PaloSanto-Fachada-Verde-2000</w:t>
+      </w:r>
+    </w:p>
+    <w:p>
+      <w:r>
+        <w:t>data-tags: exteriores</w:t>
+      </w:r>
+    </w:p>
+    <w:p>
+      <w:r>
+        <w:t>col-</w:t>
+      </w:r>
+      <w:proofErr w:type="spellStart"/>
+      <w:r>
+        <w:t>span</w:t>
+      </w:r>
+      <w:proofErr w:type="spellEnd"/>
+      <w:r>
+        <w:t>: 2</w:t>
+      </w:r>
+    </w:p>
+    <w:p>
+      <w:r>
+        <w:t xml:space="preserve">altura: 2 </w:t>
+      </w:r>
+      <w:proofErr w:type="spellStart"/>
+      <w:r>
+        <w:t>lineas</w:t>
+      </w:r>
+      <w:proofErr w:type="spellEnd"/>
+    </w:p>
+    <w:p/>
+    <w:p>
+      <w:r>
+        <w:t>2.</w:t>
+      </w:r>
+      <w:r>
         <w:t xml:space="preserve"> </w:t>
       </w:r>
       <w:r>
-        <w:t>PaloSantoSuite-8032</w:t>
+        <w:t>PaloSanto-Lobby-16-2000</w:t>
+      </w:r>
+    </w:p>
+    <w:p>
+      <w:r>
+        <w:t xml:space="preserve">data-tags: </w:t>
+      </w:r>
+      <w:proofErr w:type="spellStart"/>
+      <w:r>
+        <w:t>areas</w:t>
+      </w:r>
+      <w:proofErr w:type="spellEnd"/>
+      <w:r>
+        <w:t>-comunes</w:t>
+      </w:r>
+    </w:p>
+    <w:p>
+      <w:r>
+        <w:t>col-</w:t>
+      </w:r>
+      <w:proofErr w:type="spellStart"/>
+      <w:r>
+        <w:t>span</w:t>
+      </w:r>
+      <w:proofErr w:type="spellEnd"/>
+      <w:r>
+        <w:t xml:space="preserve">: </w:t>
+      </w:r>
+      <w:r>
+        <w:t>1</w:t>
+      </w:r>
+    </w:p>
+    <w:p>
+      <w:r>
+        <w:t xml:space="preserve">altura: 2 </w:t>
+      </w:r>
+      <w:proofErr w:type="spellStart"/>
+      <w:r>
+        <w:t>lineas</w:t>
+      </w:r>
+      <w:proofErr w:type="spellEnd"/>
+    </w:p>
+    <w:p/>
+    <w:p>
+      <w:r>
+        <w:t>3.</w:t>
       </w:r>
       <w:r>
         <w:t xml:space="preserve"> </w:t>
       </w:r>
-    </w:p>
-    <w:p>
-      <w:r>
-        <w:t>data-tags: habitaciones</w:t>
+      <w:r>
+        <w:t>PaloSanto-Jardin-IMG_0825-2000</w:t>
+      </w:r>
+    </w:p>
+    <w:p>
+      <w:r>
+        <w:t xml:space="preserve">data-tags: </w:t>
+      </w:r>
+      <w:proofErr w:type="spellStart"/>
+      <w:r>
+        <w:t>areas</w:t>
+      </w:r>
+      <w:proofErr w:type="spellEnd"/>
+      <w:r>
+        <w:t>-comunes, exteriores</w:t>
       </w:r>
     </w:p>
     <w:p>
@@ -37,184 +280,10 @@
       </w:r>
       <w:proofErr w:type="spellEnd"/>
       <w:r>
-        <w:t>: 1</w:t>
-      </w:r>
-    </w:p>
-    <w:p/>
-    <w:p>
-      <w:r>
-        <w:t>2.</w:t>
-      </w:r>
-      <w:r>
-        <w:t xml:space="preserve"> </w:t>
-      </w:r>
-      <w:r>
-        <w:t>PaloSanto-Bathrooms-IMG_8147</w:t>
-      </w:r>
-    </w:p>
-    <w:p>
-      <w:r>
-        <w:t>data-tags: habitaciones</w:t>
-      </w:r>
-    </w:p>
-    <w:p>
-      <w:r>
-        <w:t>col-</w:t>
-      </w:r>
-      <w:proofErr w:type="spellStart"/>
-      <w:r>
-        <w:t>span</w:t>
-      </w:r>
-      <w:proofErr w:type="spellEnd"/>
-      <w:r>
-        <w:t>: 1</w:t>
-      </w:r>
-    </w:p>
-    <w:p/>
-    <w:p/>
-    <w:p>
-      <w:r>
-        <w:t>3.</w:t>
-      </w:r>
-      <w:r>
-        <w:t xml:space="preserve"> </w:t>
-      </w:r>
-      <w:r>
-        <w:t>PaloSantoSuite-Cama_8119</w:t>
-      </w:r>
-    </w:p>
-    <w:p>
-      <w:r>
-        <w:t>data-tags: habitaciones</w:t>
-      </w:r>
-    </w:p>
-    <w:p>
-      <w:r>
-        <w:t>col-</w:t>
-      </w:r>
-      <w:proofErr w:type="spellStart"/>
-      <w:r>
-        <w:t>span</w:t>
-      </w:r>
-      <w:proofErr w:type="spellEnd"/>
-      <w:r>
-        <w:t>: 1</w:t>
-      </w:r>
-    </w:p>
-    <w:p/>
-    <w:p>
-      <w:r>
-        <w:t>4.</w:t>
-      </w:r>
-      <w:r>
-        <w:t xml:space="preserve"> </w:t>
-      </w:r>
-      <w:r>
-        <w:t xml:space="preserve">Suites- </w:t>
-      </w:r>
-      <w:proofErr w:type="spellStart"/>
-      <w:r>
-        <w:t>Bathroom</w:t>
-      </w:r>
-      <w:proofErr w:type="spellEnd"/>
-      <w:r>
-        <w:t xml:space="preserve"> </w:t>
-      </w:r>
-      <w:r>
-        <w:t>–</w:t>
-      </w:r>
-      <w:r>
-        <w:t xml:space="preserve"> 8250</w:t>
-      </w:r>
-    </w:p>
-    <w:p>
-      <w:r>
-        <w:t>data-tags: habitaciones</w:t>
-      </w:r>
-    </w:p>
-    <w:p>
-      <w:r>
-        <w:t>col-</w:t>
-      </w:r>
-      <w:proofErr w:type="spellStart"/>
-      <w:r>
-        <w:t>span</w:t>
-      </w:r>
-      <w:proofErr w:type="spellEnd"/>
-      <w:r>
-        <w:t>: 1</w:t>
-      </w:r>
-    </w:p>
-    <w:p/>
-    <w:p>
-      <w:r>
-        <w:t>5.</w:t>
-      </w:r>
-      <w:r>
-        <w:t xml:space="preserve"> </w:t>
-      </w:r>
-      <w:r>
-        <w:t>Grupo-Jardin-IMG_3054-324</w:t>
-      </w:r>
-      <w:r>
-        <w:t>-2000</w:t>
-      </w:r>
-    </w:p>
-    <w:p>
-      <w:r>
-        <w:t xml:space="preserve">data-tags: </w:t>
-      </w:r>
-      <w:r>
-        <w:t>exteriores, áreas comunes</w:t>
-      </w:r>
-    </w:p>
-    <w:p>
-      <w:r>
-        <w:t>col-</w:t>
-      </w:r>
-      <w:proofErr w:type="spellStart"/>
-      <w:r>
-        <w:t>span</w:t>
-      </w:r>
-      <w:proofErr w:type="spellEnd"/>
-      <w:r>
         <w:t xml:space="preserve">: </w:t>
       </w:r>
       <w:r>
-        <w:t>2</w:t>
-      </w:r>
-    </w:p>
-    <w:p/>
-    <w:p/>
-    <w:p>
-      <w:r>
-        <w:t>Tercera línea</w:t>
-      </w:r>
-    </w:p>
-    <w:p>
-      <w:r>
-        <w:t xml:space="preserve">1. </w:t>
-      </w:r>
-      <w:r>
-        <w:t>PaloSanto-Fachada-Verde-2000</w:t>
-      </w:r>
-    </w:p>
-    <w:p>
-      <w:r>
-        <w:t>data-tags: exteriores</w:t>
-      </w:r>
-    </w:p>
-    <w:p>
-      <w:r>
-        <w:t>col-</w:t>
-      </w:r>
-      <w:proofErr w:type="spellStart"/>
-      <w:r>
-        <w:t>span</w:t>
-      </w:r>
-      <w:proofErr w:type="spellEnd"/>
-      <w:r>
-        <w:t>: 2</w:t>
+        <w:t>1</w:t>
       </w:r>
     </w:p>
     <w:p>
@@ -229,130 +298,22 @@
     </w:p>
     <w:p/>
     <w:p>
-      <w:r>
-        <w:t>2.</w:t>
-      </w:r>
-      <w:r>
-        <w:t xml:space="preserve"> </w:t>
-      </w:r>
-      <w:r>
-        <w:t>PaloSanto-Lobby-16-2000</w:t>
-      </w:r>
-    </w:p>
-    <w:p>
-      <w:r>
-        <w:t xml:space="preserve">data-tags: </w:t>
-      </w:r>
-      <w:proofErr w:type="spellStart"/>
-      <w:r>
-        <w:t>areas</w:t>
-      </w:r>
-      <w:proofErr w:type="spellEnd"/>
-      <w:r>
-        <w:t>-comunes</w:t>
-      </w:r>
-    </w:p>
-    <w:p>
-      <w:r>
-        <w:t>col-</w:t>
-      </w:r>
-      <w:proofErr w:type="spellStart"/>
-      <w:r>
-        <w:t>span</w:t>
-      </w:r>
-      <w:proofErr w:type="spellEnd"/>
-      <w:r>
-        <w:t xml:space="preserve">: </w:t>
-      </w:r>
+      <w:proofErr w:type="spellStart"/>
+      <w:r>
+        <w:t>Linea</w:t>
+      </w:r>
+      <w:proofErr w:type="spellEnd"/>
+      <w:r>
+        <w:t xml:space="preserve"> 4</w:t>
+      </w:r>
+    </w:p>
+    <w:p/>
+    <w:p>
       <w:r>
         <w:t>1</w:t>
       </w:r>
-    </w:p>
-    <w:p>
-      <w:r>
-        <w:t xml:space="preserve">altura: 2 </w:t>
-      </w:r>
-      <w:proofErr w:type="spellStart"/>
-      <w:r>
-        <w:t>lineas</w:t>
-      </w:r>
-      <w:proofErr w:type="spellEnd"/>
-    </w:p>
-    <w:p/>
-    <w:p>
-      <w:r>
-        <w:t>3.</w:t>
-      </w:r>
-      <w:r>
-        <w:t xml:space="preserve"> </w:t>
-      </w:r>
-      <w:r>
-        <w:t>PaloSanto-Jardin-IMG_0825-2000</w:t>
-      </w:r>
-    </w:p>
-    <w:p>
-      <w:r>
-        <w:t xml:space="preserve">data-tags: </w:t>
-      </w:r>
-      <w:proofErr w:type="spellStart"/>
-      <w:r>
-        <w:t>areas</w:t>
-      </w:r>
-      <w:proofErr w:type="spellEnd"/>
-      <w:r>
-        <w:t>-comunes</w:t>
-      </w:r>
-      <w:r>
-        <w:t>, exteriores</w:t>
-      </w:r>
-    </w:p>
-    <w:p>
-      <w:r>
-        <w:t>col-</w:t>
-      </w:r>
-      <w:proofErr w:type="spellStart"/>
-      <w:r>
-        <w:t>span</w:t>
-      </w:r>
-      <w:proofErr w:type="spellEnd"/>
-      <w:r>
-        <w:t xml:space="preserve">: </w:t>
-      </w:r>
-      <w:r>
-        <w:t>1</w:t>
-      </w:r>
-    </w:p>
-    <w:p>
-      <w:r>
-        <w:t xml:space="preserve">altura: 2 </w:t>
-      </w:r>
-      <w:proofErr w:type="spellStart"/>
-      <w:r>
-        <w:t>lineas</w:t>
-      </w:r>
-      <w:proofErr w:type="spellEnd"/>
-    </w:p>
-    <w:p/>
-    <w:p>
-      <w:proofErr w:type="spellStart"/>
-      <w:r>
-        <w:t>Linea</w:t>
-      </w:r>
-      <w:proofErr w:type="spellEnd"/>
-      <w:r>
-        <w:t xml:space="preserve"> 4</w:t>
-      </w:r>
-    </w:p>
-    <w:p/>
-    <w:p>
-      <w:r>
-        <w:t>1</w:t>
-      </w:r>
-      <w:r>
-        <w:t xml:space="preserve"> </w:t>
-      </w:r>
-      <w:r>
-        <w:t>TerraceSuite-_MG_5255</w:t>
+      <w:r>
+        <w:t xml:space="preserve"> TerraceSuite-_MG_5255</w:t>
       </w:r>
     </w:p>
     <w:p>
@@ -459,41 +420,640 @@
       </w:r>
       <w:proofErr w:type="spellEnd"/>
       <w:r>
+        <w:t>: 2</w:t>
+      </w:r>
+    </w:p>
+    <w:p>
+      <w:r>
+        <w:t xml:space="preserve">altura: 2 </w:t>
+      </w:r>
+      <w:proofErr w:type="spellStart"/>
+      <w:r>
+        <w:t>lineas</w:t>
+      </w:r>
+      <w:proofErr w:type="spellEnd"/>
+    </w:p>
+    <w:p/>
+    <w:p>
+      <w:r>
+        <w:t xml:space="preserve">4 </w:t>
+      </w:r>
+      <w:r>
+        <w:t>PaloSanto-Lobby-escultura-2000</w:t>
+      </w:r>
+    </w:p>
+    <w:p>
+      <w:r>
+        <w:t xml:space="preserve">data-tags: </w:t>
+      </w:r>
+      <w:proofErr w:type="spellStart"/>
+      <w:r>
+        <w:t>areas</w:t>
+      </w:r>
+      <w:proofErr w:type="spellEnd"/>
+      <w:r>
+        <w:t xml:space="preserve"> comunes</w:t>
+      </w:r>
+    </w:p>
+    <w:p>
+      <w:r>
+        <w:t>col-span:1</w:t>
+      </w:r>
+    </w:p>
+    <w:p>
+      <w:r>
+        <w:t xml:space="preserve">altura: 2 </w:t>
+      </w:r>
+      <w:proofErr w:type="spellStart"/>
+      <w:r>
+        <w:t>lineas</w:t>
+      </w:r>
+      <w:proofErr w:type="spellEnd"/>
+    </w:p>
+    <w:p/>
+    <w:p>
+      <w:proofErr w:type="spellStart"/>
+      <w:r>
+        <w:t>Linea</w:t>
+      </w:r>
+      <w:proofErr w:type="spellEnd"/>
+      <w:r>
+        <w:t xml:space="preserve"> 5</w:t>
+      </w:r>
+    </w:p>
+    <w:p>
+      <w:r>
+        <w:t>1</w:t>
+      </w:r>
+      <w:r>
+        <w:t xml:space="preserve"> PremiumRoom_MG_8336</w:t>
+      </w:r>
+    </w:p>
+    <w:p>
+      <w:r>
+        <w:t>data-tags: habitaciones</w:t>
+      </w:r>
+    </w:p>
+    <w:p>
+      <w:r>
+        <w:t>col-</w:t>
+      </w:r>
+      <w:proofErr w:type="spellStart"/>
+      <w:r>
+        <w:t>span</w:t>
+      </w:r>
+      <w:proofErr w:type="spellEnd"/>
+      <w:r>
+        <w:t>: 2</w:t>
+      </w:r>
+    </w:p>
+    <w:p>
+      <w:r>
+        <w:t xml:space="preserve">altura: 2 </w:t>
+      </w:r>
+      <w:proofErr w:type="spellStart"/>
+      <w:r>
+        <w:t>lineas</w:t>
+      </w:r>
+      <w:proofErr w:type="spellEnd"/>
+    </w:p>
+    <w:p/>
+    <w:p>
+      <w:r>
+        <w:t xml:space="preserve">2 </w:t>
+      </w:r>
+      <w:r>
+        <w:t>PaloSanto-PremiumRoom-IMG_7987</w:t>
+      </w:r>
+    </w:p>
+    <w:p>
+      <w:r>
+        <w:t>data-tags: habitaciones</w:t>
+      </w:r>
+    </w:p>
+    <w:p>
+      <w:r>
+        <w:t>col-</w:t>
+      </w:r>
+      <w:proofErr w:type="spellStart"/>
+      <w:r>
+        <w:t>span</w:t>
+      </w:r>
+      <w:proofErr w:type="spellEnd"/>
+      <w:r>
+        <w:t>: 2</w:t>
+      </w:r>
+    </w:p>
+    <w:p>
+      <w:r>
+        <w:t xml:space="preserve">altura: 2 </w:t>
+      </w:r>
+      <w:proofErr w:type="spellStart"/>
+      <w:r>
+        <w:t>lineas</w:t>
+      </w:r>
+      <w:proofErr w:type="spellEnd"/>
+    </w:p>
+    <w:p/>
+    <w:p>
+      <w:proofErr w:type="spellStart"/>
+      <w:r>
+        <w:t>Linea</w:t>
+      </w:r>
+      <w:proofErr w:type="spellEnd"/>
+      <w:r>
+        <w:t xml:space="preserve"> 6</w:t>
+      </w:r>
+    </w:p>
+    <w:p>
+      <w:r>
+        <w:t xml:space="preserve">1 </w:t>
+      </w:r>
+      <w:r>
+        <w:t>PaloSantoSuite-8343</w:t>
+      </w:r>
+    </w:p>
+    <w:p>
+      <w:r>
+        <w:t>data-tags: habitaciones</w:t>
+      </w:r>
+    </w:p>
+    <w:p>
+      <w:r>
+        <w:t>col-</w:t>
+      </w:r>
+      <w:proofErr w:type="spellStart"/>
+      <w:r>
+        <w:t>span</w:t>
+      </w:r>
+      <w:proofErr w:type="spellEnd"/>
+      <w:r>
+        <w:t>: 1</w:t>
+      </w:r>
+    </w:p>
+    <w:p>
+      <w:r>
+        <w:t xml:space="preserve">altura: 1 </w:t>
+      </w:r>
+      <w:proofErr w:type="spellStart"/>
+      <w:r>
+        <w:t>linea</w:t>
+      </w:r>
+      <w:proofErr w:type="spellEnd"/>
+    </w:p>
+    <w:p/>
+    <w:p>
+      <w:r>
+        <w:t xml:space="preserve">2 </w:t>
+      </w:r>
+      <w:r>
+        <w:t>Fachada-Psanto05</w:t>
+      </w:r>
+    </w:p>
+    <w:p>
+      <w:r>
+        <w:t>data-tags: exteriores</w:t>
+      </w:r>
+    </w:p>
+    <w:p>
+      <w:r>
+        <w:t>col-</w:t>
+      </w:r>
+      <w:proofErr w:type="spellStart"/>
+      <w:r>
+        <w:t>span</w:t>
+      </w:r>
+      <w:proofErr w:type="spellEnd"/>
+      <w:r>
+        <w:t>: 1</w:t>
+      </w:r>
+    </w:p>
+    <w:p>
+      <w:r>
+        <w:t xml:space="preserve">altura: 1 </w:t>
+      </w:r>
+      <w:proofErr w:type="spellStart"/>
+      <w:r>
+        <w:t>linea</w:t>
+      </w:r>
+      <w:proofErr w:type="spellEnd"/>
+    </w:p>
+    <w:p/>
+    <w:p>
+      <w:r>
+        <w:t>3</w:t>
+      </w:r>
+      <w:r>
+        <w:t xml:space="preserve"> Deluxe-8266</w:t>
+      </w:r>
+    </w:p>
+    <w:p>
+      <w:r>
+        <w:t>data-tags: habitaciones</w:t>
+      </w:r>
+    </w:p>
+    <w:p>
+      <w:r>
+        <w:t>col-</w:t>
+      </w:r>
+      <w:proofErr w:type="spellStart"/>
+      <w:r>
+        <w:t>span</w:t>
+      </w:r>
+      <w:proofErr w:type="spellEnd"/>
+      <w:r>
+        <w:t>: 1</w:t>
+      </w:r>
+    </w:p>
+    <w:p>
+      <w:r>
+        <w:t xml:space="preserve">altura: 1 </w:t>
+      </w:r>
+      <w:proofErr w:type="spellStart"/>
+      <w:r>
+        <w:t>linea</w:t>
+      </w:r>
+      <w:proofErr w:type="spellEnd"/>
+    </w:p>
+    <w:p/>
+    <w:p/>
+    <w:p>
+      <w:r>
+        <w:t>4</w:t>
+      </w:r>
+      <w:r>
+        <w:t xml:space="preserve"> </w:t>
+      </w:r>
+      <w:r>
+        <w:t>Desayuno-Buffet-IMG_2345</w:t>
+      </w:r>
+    </w:p>
+    <w:p>
+      <w:r>
+        <w:t xml:space="preserve">data-tags: restaurante, </w:t>
+      </w:r>
+      <w:proofErr w:type="spellStart"/>
+      <w:r>
+        <w:t>areas</w:t>
+      </w:r>
+      <w:proofErr w:type="spellEnd"/>
+      <w:r>
+        <w:t>-comunes</w:t>
+      </w:r>
+    </w:p>
+    <w:p>
+      <w:r>
+        <w:t>col-</w:t>
+      </w:r>
+      <w:proofErr w:type="spellStart"/>
+      <w:r>
+        <w:t>span</w:t>
+      </w:r>
+      <w:proofErr w:type="spellEnd"/>
+      <w:r>
+        <w:t>: 1</w:t>
+      </w:r>
+    </w:p>
+    <w:p>
+      <w:r>
+        <w:t xml:space="preserve">altura: 1 </w:t>
+      </w:r>
+      <w:proofErr w:type="spellStart"/>
+      <w:r>
+        <w:t>linea</w:t>
+      </w:r>
+      <w:proofErr w:type="spellEnd"/>
+    </w:p>
+    <w:p/>
+    <w:p/>
+    <w:p/>
+    <w:p/>
+    <w:p>
+      <w:r>
+        <w:t>5</w:t>
+      </w:r>
+      <w:r>
+        <w:t xml:space="preserve"> </w:t>
+      </w:r>
+      <w:r>
+        <w:t>Desayuno-Buffet-7-IMG_2250</w:t>
+      </w:r>
+    </w:p>
+    <w:p>
+      <w:r>
+        <w:t xml:space="preserve">data-tags: restaurante, </w:t>
+      </w:r>
+      <w:proofErr w:type="spellStart"/>
+      <w:r>
+        <w:t>areas</w:t>
+      </w:r>
+      <w:proofErr w:type="spellEnd"/>
+      <w:r>
+        <w:t>-comunes</w:t>
+      </w:r>
+    </w:p>
+    <w:p>
+      <w:r>
+        <w:t>col-</w:t>
+      </w:r>
+      <w:proofErr w:type="spellStart"/>
+      <w:r>
+        <w:t>span</w:t>
+      </w:r>
+      <w:proofErr w:type="spellEnd"/>
+      <w:r>
+        <w:t>: 2</w:t>
+      </w:r>
+    </w:p>
+    <w:p>
+      <w:r>
+        <w:t xml:space="preserve">altura: 1 </w:t>
+      </w:r>
+      <w:proofErr w:type="spellStart"/>
+      <w:r>
+        <w:t>linea</w:t>
+      </w:r>
+      <w:proofErr w:type="spellEnd"/>
+    </w:p>
+    <w:p/>
+    <w:p>
+      <w:r>
+        <w:t xml:space="preserve"> </w:t>
+      </w:r>
+      <w:proofErr w:type="spellStart"/>
+      <w:r>
+        <w:t>Linea</w:t>
+      </w:r>
+      <w:proofErr w:type="spellEnd"/>
+      <w:r>
+        <w:t xml:space="preserve"> 7</w:t>
+      </w:r>
+    </w:p>
+    <w:p>
+      <w:r>
+        <w:t xml:space="preserve">1 </w:t>
+      </w:r>
+      <w:r>
+        <w:t>Palier_MG_5190</w:t>
+      </w:r>
+    </w:p>
+    <w:p>
+      <w:r>
+        <w:t xml:space="preserve">data-tags: </w:t>
+      </w:r>
+      <w:proofErr w:type="spellStart"/>
+      <w:r>
+        <w:t>areas</w:t>
+      </w:r>
+      <w:proofErr w:type="spellEnd"/>
+      <w:r>
+        <w:t xml:space="preserve"> </w:t>
+      </w:r>
+      <w:r>
+        <w:t>comunes, habitaciones</w:t>
+      </w:r>
+    </w:p>
+    <w:p>
+      <w:r>
+        <w:t>col-</w:t>
+      </w:r>
+      <w:proofErr w:type="spellStart"/>
+      <w:r>
+        <w:t>span</w:t>
+      </w:r>
+      <w:proofErr w:type="spellEnd"/>
+      <w:r>
+        <w:t>: 2</w:t>
+      </w:r>
+    </w:p>
+    <w:p>
+      <w:r>
+        <w:t xml:space="preserve">altura: 2 </w:t>
+      </w:r>
+      <w:proofErr w:type="spellStart"/>
+      <w:r>
+        <w:t>lineas</w:t>
+      </w:r>
+      <w:proofErr w:type="spellEnd"/>
+    </w:p>
+    <w:p/>
+    <w:p/>
+    <w:p>
+      <w:r>
+        <w:t xml:space="preserve">2 </w:t>
+      </w:r>
+      <w:r>
+        <w:t>PaloSanto-Restaurante-ByN-IMG_2139-2000</w:t>
+      </w:r>
+    </w:p>
+    <w:p>
+      <w:r>
+        <w:t xml:space="preserve">data-tags: </w:t>
+      </w:r>
+      <w:proofErr w:type="spellStart"/>
+      <w:r>
+        <w:t>areas</w:t>
+      </w:r>
+      <w:proofErr w:type="spellEnd"/>
+      <w:r>
+        <w:t xml:space="preserve"> comunes, desayuno</w:t>
+      </w:r>
+    </w:p>
+    <w:p>
+      <w:r>
+        <w:t>col-</w:t>
+      </w:r>
+      <w:proofErr w:type="spellStart"/>
+      <w:r>
+        <w:t>span</w:t>
+      </w:r>
+      <w:proofErr w:type="spellEnd"/>
+      <w:r>
+        <w:t>: 2</w:t>
+      </w:r>
+    </w:p>
+    <w:p>
+      <w:r>
+        <w:t xml:space="preserve">altura: 2 </w:t>
+      </w:r>
+      <w:proofErr w:type="spellStart"/>
+      <w:r>
+        <w:t>lineas</w:t>
+      </w:r>
+      <w:proofErr w:type="spellEnd"/>
+    </w:p>
+    <w:p/>
+    <w:p>
+      <w:pPr>
+        <w:ind w:left="708"/>
+      </w:pPr>
+      <w:proofErr w:type="spellStart"/>
+      <w:r>
+        <w:t>Linea</w:t>
+      </w:r>
+      <w:proofErr w:type="spellEnd"/>
+      <w:r>
+        <w:t xml:space="preserve"> 8</w:t>
+      </w:r>
+    </w:p>
+    <w:p>
+      <w:pPr>
+        <w:ind w:left="708"/>
+      </w:pPr>
+    </w:p>
+    <w:p>
+      <w:pPr>
+        <w:ind w:left="708"/>
+      </w:pPr>
+      <w:r>
+        <w:t xml:space="preserve">1 </w:t>
+      </w:r>
+      <w:r>
+        <w:t>PaloSanto-Bicicletas-Guest-Bikes-DSC_0299</w:t>
+      </w:r>
+    </w:p>
+    <w:p>
+      <w:pPr>
+        <w:ind w:left="708"/>
+      </w:pPr>
+      <w:r>
+        <w:t xml:space="preserve">data-tags: </w:t>
+      </w:r>
+      <w:r>
+        <w:t>servicios</w:t>
+      </w:r>
+    </w:p>
+    <w:p>
+      <w:pPr>
+        <w:ind w:left="708"/>
+      </w:pPr>
+      <w:r>
+        <w:t>col-</w:t>
+      </w:r>
+      <w:proofErr w:type="spellStart"/>
+      <w:r>
+        <w:t>span</w:t>
+      </w:r>
+      <w:proofErr w:type="spellEnd"/>
+      <w:r>
         <w:t xml:space="preserve">: </w:t>
       </w:r>
       <w:r>
+        <w:t>1</w:t>
+      </w:r>
+    </w:p>
+    <w:p>
+      <w:pPr>
+        <w:ind w:left="708"/>
+      </w:pPr>
+      <w:r>
+        <w:t xml:space="preserve">altura: 1 </w:t>
+      </w:r>
+      <w:proofErr w:type="spellStart"/>
+      <w:r>
+        <w:t>linea</w:t>
+      </w:r>
+      <w:proofErr w:type="spellEnd"/>
+    </w:p>
+    <w:p>
+      <w:pPr>
+        <w:ind w:left="708"/>
+      </w:pPr>
+    </w:p>
+    <w:p>
+      <w:pPr>
+        <w:ind w:left="708"/>
+      </w:pPr>
+      <w:r>
         <w:t>2</w:t>
       </w:r>
-    </w:p>
-    <w:p>
-      <w:r>
-        <w:t xml:space="preserve">altura: </w:t>
-      </w:r>
-      <w:r>
-        <w:t>2</w:t>
-      </w:r>
       <w:r>
         <w:t xml:space="preserve"> </w:t>
       </w:r>
+      <w:r>
+        <w:t>Restaur</w:t>
+      </w:r>
+      <w:r>
+        <w:t>an</w:t>
+      </w:r>
+      <w:r>
+        <w:t>te-IMG_8187-2000</w:t>
+      </w:r>
+    </w:p>
+    <w:p>
+      <w:pPr>
+        <w:ind w:left="708"/>
+      </w:pPr>
+      <w:r>
+        <w:t xml:space="preserve">data-tags: </w:t>
+      </w:r>
+      <w:proofErr w:type="spellStart"/>
+      <w:r>
+        <w:t>areas</w:t>
+      </w:r>
+      <w:proofErr w:type="spellEnd"/>
+      <w:r>
+        <w:t xml:space="preserve"> </w:t>
+      </w:r>
+      <w:r>
+        <w:t>comunes</w:t>
+      </w:r>
+    </w:p>
+    <w:p>
+      <w:pPr>
+        <w:ind w:left="708"/>
+      </w:pPr>
+      <w:r>
+        <w:t>col-</w:t>
+      </w:r>
+      <w:proofErr w:type="spellStart"/>
+      <w:r>
+        <w:t>span</w:t>
+      </w:r>
+      <w:proofErr w:type="spellEnd"/>
+      <w:r>
+        <w:t xml:space="preserve">: </w:t>
+      </w:r>
+      <w:r>
+        <w:t>1</w:t>
+      </w:r>
+    </w:p>
+    <w:p>
+      <w:pPr>
+        <w:ind w:left="708"/>
+      </w:pPr>
+      <w:r>
+        <w:t xml:space="preserve">altura: 1 </w:t>
+      </w:r>
       <w:proofErr w:type="spellStart"/>
       <w:r>
         <w:t>linea</w:t>
       </w:r>
-      <w:r>
-        <w:t>s</w:t>
-      </w:r>
-      <w:proofErr w:type="spellEnd"/>
-    </w:p>
-    <w:p/>
-    <w:p>
-      <w:r>
-        <w:t xml:space="preserve">4 </w:t>
-      </w:r>
-      <w:r>
-        <w:t>PaloSanto-Lobby-escultura-2000</w:t>
-      </w:r>
-    </w:p>
-    <w:p>
+      <w:proofErr w:type="spellEnd"/>
+    </w:p>
+    <w:p>
+      <w:pPr>
+        <w:ind w:left="708"/>
+      </w:pPr>
+    </w:p>
+    <w:p>
+      <w:pPr>
+        <w:ind w:left="708"/>
+      </w:pPr>
+      <w:r>
+        <w:t>3</w:t>
+      </w:r>
+      <w:r>
+        <w:t xml:space="preserve"> </w:t>
+      </w:r>
+      <w:r>
+        <w:t>Desayuno-DIC23-2000</w:t>
+      </w:r>
+    </w:p>
+    <w:p>
+      <w:pPr>
+        <w:ind w:left="708"/>
+      </w:pPr>
       <w:r>
         <w:t xml:space="preserve">data-tags: </w:t>
       </w:r>
@@ -503,15 +1063,29 @@
       </w:r>
       <w:proofErr w:type="spellEnd"/>
       <w:r>
-        <w:t xml:space="preserve"> comunes</w:t>
-      </w:r>
-    </w:p>
-    <w:p>
-      <w:r>
-        <w:t>col-span:1</w:t>
-      </w:r>
-    </w:p>
-    <w:p>
+        <w:t xml:space="preserve"> comunes, desayuno</w:t>
+      </w:r>
+    </w:p>
+    <w:p>
+      <w:pPr>
+        <w:ind w:left="708"/>
+      </w:pPr>
+      <w:r>
+        <w:t>col-</w:t>
+      </w:r>
+      <w:proofErr w:type="spellStart"/>
+      <w:r>
+        <w:t>span</w:t>
+      </w:r>
+      <w:proofErr w:type="spellEnd"/>
+      <w:r>
+        <w:t>: 2</w:t>
+      </w:r>
+    </w:p>
+    <w:p>
+      <w:pPr>
+        <w:ind w:left="708"/>
+      </w:pPr>
       <w:r>
         <w:t xml:space="preserve">altura: 2 </w:t>
       </w:r>
@@ -521,661 +1095,64 @@
       </w:r>
       <w:proofErr w:type="spellEnd"/>
     </w:p>
-    <w:p/>
-    <w:p>
-      <w:proofErr w:type="spellStart"/>
-      <w:r>
-        <w:t>Linea</w:t>
-      </w:r>
-      <w:proofErr w:type="spellEnd"/>
-      <w:r>
-        <w:t xml:space="preserve"> 5</w:t>
-      </w:r>
-    </w:p>
-    <w:p>
+    <w:p>
+      <w:pPr>
+        <w:ind w:left="708"/>
+      </w:pPr>
+    </w:p>
+    <w:p>
+      <w:pPr>
+        <w:ind w:left="708"/>
+      </w:pPr>
+      <w:r>
+        <w:t>4. PaloSanto-Restaurante-ByN-IMG_2113-2000</w:t>
+      </w:r>
+    </w:p>
+    <w:p>
+      <w:pPr>
+        <w:ind w:left="708"/>
+      </w:pPr>
+      <w:r>
+        <w:t xml:space="preserve">data-tags: </w:t>
+      </w:r>
+      <w:proofErr w:type="spellStart"/>
+      <w:r>
+        <w:t>areas</w:t>
+      </w:r>
+      <w:proofErr w:type="spellEnd"/>
+      <w:r>
+        <w:t xml:space="preserve"> comunes, desayuno</w:t>
+      </w:r>
+    </w:p>
+    <w:p>
+      <w:pPr>
+        <w:ind w:left="708"/>
+      </w:pPr>
+      <w:r>
+        <w:t>col-</w:t>
+      </w:r>
+      <w:proofErr w:type="spellStart"/>
+      <w:r>
+        <w:t>span</w:t>
+      </w:r>
+      <w:proofErr w:type="spellEnd"/>
+      <w:r>
+        <w:t xml:space="preserve">: </w:t>
+      </w:r>
       <w:r>
         <w:t>1</w:t>
       </w:r>
-      <w:r>
-        <w:t xml:space="preserve"> </w:t>
-      </w:r>
-      <w:r>
-        <w:t>PremiumRoom_MG_8336</w:t>
-      </w:r>
-    </w:p>
-    <w:p>
-      <w:r>
-        <w:t>data-tags: habitaciones</w:t>
-      </w:r>
-    </w:p>
-    <w:p>
-      <w:r>
-        <w:t>col-</w:t>
-      </w:r>
-      <w:proofErr w:type="spellStart"/>
-      <w:r>
-        <w:t>span</w:t>
-      </w:r>
-      <w:proofErr w:type="spellEnd"/>
-      <w:r>
-        <w:t>: 2</w:t>
-      </w:r>
-    </w:p>
-    <w:p>
+    </w:p>
+    <w:p>
+      <w:pPr>
+        <w:ind w:left="708"/>
+      </w:pPr>
       <w:r>
         <w:t xml:space="preserve">altura: 2 </w:t>
       </w:r>
       <w:proofErr w:type="spellStart"/>
       <w:r>
         <w:t>lineas</w:t>
-      </w:r>
-      <w:proofErr w:type="spellEnd"/>
-    </w:p>
-    <w:p/>
-    <w:p>
-      <w:r>
-        <w:t xml:space="preserve">2 </w:t>
-      </w:r>
-      <w:r>
-        <w:t>PaloSanto-PremiumRoom-IMG_7987</w:t>
-      </w:r>
-    </w:p>
-    <w:p>
-      <w:r>
-        <w:t>data-tags: habitaciones</w:t>
-      </w:r>
-    </w:p>
-    <w:p>
-      <w:r>
-        <w:t>col-</w:t>
-      </w:r>
-      <w:proofErr w:type="spellStart"/>
-      <w:r>
-        <w:t>span</w:t>
-      </w:r>
-      <w:proofErr w:type="spellEnd"/>
-      <w:r>
-        <w:t>: 2</w:t>
-      </w:r>
-    </w:p>
-    <w:p>
-      <w:r>
-        <w:t xml:space="preserve">altura: 2 </w:t>
-      </w:r>
-      <w:proofErr w:type="spellStart"/>
-      <w:r>
-        <w:t>lineas</w:t>
-      </w:r>
-      <w:proofErr w:type="spellEnd"/>
-    </w:p>
-    <w:p/>
-    <w:p>
-      <w:proofErr w:type="spellStart"/>
-      <w:r>
-        <w:t>Linea</w:t>
-      </w:r>
-      <w:proofErr w:type="spellEnd"/>
-      <w:r>
-        <w:t xml:space="preserve"> 6</w:t>
-      </w:r>
-    </w:p>
-    <w:p>
-      <w:r>
-        <w:t xml:space="preserve">1 </w:t>
-      </w:r>
-      <w:r>
-        <w:t>PaloSantoSuite-8343</w:t>
-      </w:r>
-    </w:p>
-    <w:p>
-      <w:r>
-        <w:t>data-tags: habitaciones</w:t>
-      </w:r>
-    </w:p>
-    <w:p>
-      <w:r>
-        <w:t>col-</w:t>
-      </w:r>
-      <w:proofErr w:type="spellStart"/>
-      <w:r>
-        <w:t>span</w:t>
-      </w:r>
-      <w:proofErr w:type="spellEnd"/>
-      <w:r>
-        <w:t xml:space="preserve">: </w:t>
-      </w:r>
-      <w:r>
-        <w:t>1</w:t>
-      </w:r>
-    </w:p>
-    <w:p>
-      <w:r>
-        <w:t xml:space="preserve">altura: </w:t>
-      </w:r>
-      <w:r>
-        <w:t xml:space="preserve">1 </w:t>
-      </w:r>
-      <w:proofErr w:type="spellStart"/>
-      <w:r>
-        <w:t>linea</w:t>
-      </w:r>
-      <w:proofErr w:type="spellEnd"/>
-    </w:p>
-    <w:p/>
-    <w:p>
-      <w:r>
-        <w:t xml:space="preserve">2 </w:t>
-      </w:r>
-      <w:r>
-        <w:t>Fachada-Psanto05</w:t>
-      </w:r>
-    </w:p>
-    <w:p>
-      <w:r>
-        <w:t xml:space="preserve">data-tags: </w:t>
-      </w:r>
-      <w:r>
-        <w:t>exteriores</w:t>
-      </w:r>
-    </w:p>
-    <w:p>
-      <w:r>
-        <w:t>col-</w:t>
-      </w:r>
-      <w:proofErr w:type="spellStart"/>
-      <w:r>
-        <w:t>span</w:t>
-      </w:r>
-      <w:proofErr w:type="spellEnd"/>
-      <w:r>
-        <w:t>: 1</w:t>
-      </w:r>
-    </w:p>
-    <w:p>
-      <w:r>
-        <w:t xml:space="preserve">altura: 1 </w:t>
-      </w:r>
-      <w:proofErr w:type="spellStart"/>
-      <w:r>
-        <w:t>linea</w:t>
-      </w:r>
-      <w:proofErr w:type="spellEnd"/>
-    </w:p>
-    <w:p/>
-    <w:p>
-      <w:r>
-        <w:t>3</w:t>
-      </w:r>
-      <w:r>
-        <w:t xml:space="preserve"> </w:t>
-      </w:r>
-      <w:r>
-        <w:t>Deluxe-8266</w:t>
-      </w:r>
-    </w:p>
-    <w:p>
-      <w:r>
-        <w:t>data-tags: habitaciones</w:t>
-      </w:r>
-    </w:p>
-    <w:p>
-      <w:r>
-        <w:t>col-</w:t>
-      </w:r>
-      <w:proofErr w:type="spellStart"/>
-      <w:r>
-        <w:t>span</w:t>
-      </w:r>
-      <w:proofErr w:type="spellEnd"/>
-      <w:r>
-        <w:t>: 1</w:t>
-      </w:r>
-    </w:p>
-    <w:p>
-      <w:r>
-        <w:t xml:space="preserve">altura: 1 </w:t>
-      </w:r>
-      <w:proofErr w:type="spellStart"/>
-      <w:r>
-        <w:t>linea</w:t>
-      </w:r>
-      <w:proofErr w:type="spellEnd"/>
-    </w:p>
-    <w:p/>
-    <w:p/>
-    <w:p>
-      <w:r>
-        <w:t>4</w:t>
-      </w:r>
-      <w:r>
-        <w:t xml:space="preserve"> </w:t>
-      </w:r>
-      <w:r>
-        <w:t>Desayuno-Buffet-IMG_2345</w:t>
-      </w:r>
-    </w:p>
-    <w:p>
-      <w:r>
-        <w:t xml:space="preserve">data-tags: </w:t>
-      </w:r>
-      <w:r>
-        <w:t xml:space="preserve">restaurante, </w:t>
-      </w:r>
-      <w:proofErr w:type="spellStart"/>
-      <w:r>
-        <w:t>areas</w:t>
-      </w:r>
-      <w:proofErr w:type="spellEnd"/>
-      <w:r>
-        <w:t>-comunes</w:t>
-      </w:r>
-    </w:p>
-    <w:p>
-      <w:r>
-        <w:t>col-</w:t>
-      </w:r>
-      <w:proofErr w:type="spellStart"/>
-      <w:r>
-        <w:t>span</w:t>
-      </w:r>
-      <w:proofErr w:type="spellEnd"/>
-      <w:r>
-        <w:t>: 1</w:t>
-      </w:r>
-    </w:p>
-    <w:p>
-      <w:r>
-        <w:t xml:space="preserve">altura: 1 </w:t>
-      </w:r>
-      <w:proofErr w:type="spellStart"/>
-      <w:r>
-        <w:t>linea</w:t>
-      </w:r>
-      <w:proofErr w:type="spellEnd"/>
-    </w:p>
-    <w:p/>
-    <w:p/>
-    <w:p/>
-    <w:p/>
-    <w:p>
-      <w:r>
-        <w:t>5</w:t>
-      </w:r>
-      <w:r>
-        <w:t xml:space="preserve"> </w:t>
-      </w:r>
-      <w:r>
-        <w:t>Desayuno-Buffet-7-IMG_2250</w:t>
-      </w:r>
-    </w:p>
-    <w:p>
-      <w:r>
-        <w:t xml:space="preserve">data-tags: restaurante, </w:t>
-      </w:r>
-      <w:proofErr w:type="spellStart"/>
-      <w:r>
-        <w:t>areas</w:t>
-      </w:r>
-      <w:proofErr w:type="spellEnd"/>
-      <w:r>
-        <w:t>-comunes</w:t>
-      </w:r>
-    </w:p>
-    <w:p>
-      <w:r>
-        <w:t>col-</w:t>
-      </w:r>
-      <w:proofErr w:type="spellStart"/>
-      <w:r>
-        <w:t>span</w:t>
-      </w:r>
-      <w:proofErr w:type="spellEnd"/>
-      <w:r>
-        <w:t xml:space="preserve">: </w:t>
-      </w:r>
-      <w:r>
-        <w:t>2</w:t>
-      </w:r>
-    </w:p>
-    <w:p>
-      <w:r>
-        <w:t xml:space="preserve">altura: 1 </w:t>
-      </w:r>
-      <w:proofErr w:type="spellStart"/>
-      <w:r>
-        <w:t>linea</w:t>
-      </w:r>
-      <w:proofErr w:type="spellEnd"/>
-    </w:p>
-    <w:p/>
-    <w:p>
-      <w:r>
-        <w:t xml:space="preserve"> </w:t>
-      </w:r>
-      <w:proofErr w:type="spellStart"/>
-      <w:r>
-        <w:t>Linea</w:t>
-      </w:r>
-      <w:proofErr w:type="spellEnd"/>
-      <w:r>
-        <w:t xml:space="preserve"> 7</w:t>
-      </w:r>
-    </w:p>
-    <w:p>
-      <w:r>
-        <w:t xml:space="preserve">1 </w:t>
-      </w:r>
-      <w:r>
-        <w:t>Palier_MG_5190</w:t>
-      </w:r>
-    </w:p>
-    <w:p>
-      <w:r>
-        <w:t xml:space="preserve">data-tags: </w:t>
-      </w:r>
-      <w:proofErr w:type="spellStart"/>
-      <w:r>
-        <w:t>areas</w:t>
-      </w:r>
-      <w:proofErr w:type="spellEnd"/>
-      <w:r>
-        <w:t xml:space="preserve"> </w:t>
-      </w:r>
-      <w:r>
-        <w:t>comunes, habitaciones</w:t>
-      </w:r>
-    </w:p>
-    <w:p>
-      <w:r>
-        <w:t>col-</w:t>
-      </w:r>
-      <w:proofErr w:type="spellStart"/>
-      <w:r>
-        <w:t>span</w:t>
-      </w:r>
-      <w:proofErr w:type="spellEnd"/>
-      <w:r>
-        <w:t>: 2</w:t>
-      </w:r>
-    </w:p>
-    <w:p>
-      <w:r>
-        <w:t xml:space="preserve">altura: 2 </w:t>
-      </w:r>
-      <w:proofErr w:type="spellStart"/>
-      <w:r>
-        <w:t>lineas</w:t>
-      </w:r>
-      <w:proofErr w:type="spellEnd"/>
-    </w:p>
-    <w:p/>
-    <w:p/>
-    <w:p>
-      <w:r>
-        <w:t xml:space="preserve">2 </w:t>
-      </w:r>
-      <w:r>
-        <w:t>PaloSanto-Restaurante-ByN-IMG_2139-2000</w:t>
-      </w:r>
-    </w:p>
-    <w:p>
-      <w:r>
-        <w:t xml:space="preserve">data-tags: </w:t>
-      </w:r>
-      <w:proofErr w:type="spellStart"/>
-      <w:r>
-        <w:t>areas</w:t>
-      </w:r>
-      <w:proofErr w:type="spellEnd"/>
-      <w:r>
-        <w:t xml:space="preserve"> comunes, desayuno</w:t>
-      </w:r>
-    </w:p>
-    <w:p>
-      <w:r>
-        <w:t>col-</w:t>
-      </w:r>
-      <w:proofErr w:type="spellStart"/>
-      <w:r>
-        <w:t>span</w:t>
-      </w:r>
-      <w:proofErr w:type="spellEnd"/>
-      <w:r>
-        <w:t>: 2</w:t>
-      </w:r>
-    </w:p>
-    <w:p>
-      <w:r>
-        <w:t xml:space="preserve">altura: 2 </w:t>
-      </w:r>
-      <w:proofErr w:type="spellStart"/>
-      <w:r>
-        <w:t>lineas</w:t>
-      </w:r>
-      <w:proofErr w:type="spellEnd"/>
-    </w:p>
-    <w:p/>
-    <w:p>
-      <w:proofErr w:type="spellStart"/>
-      <w:r>
-        <w:t>Linea</w:t>
-      </w:r>
-      <w:proofErr w:type="spellEnd"/>
-      <w:r>
-        <w:t xml:space="preserve"> 8</w:t>
-      </w:r>
-    </w:p>
-    <w:p/>
-    <w:p>
-      <w:r>
-        <w:t xml:space="preserve">1 </w:t>
-      </w:r>
-      <w:r>
-        <w:t>PaloSanto-Bicicletas-Guest-Bikes-DSC_0299</w:t>
-      </w:r>
-    </w:p>
-    <w:p>
-      <w:r>
-        <w:t xml:space="preserve">data-tags: </w:t>
-      </w:r>
-      <w:r>
-        <w:t>servicios</w:t>
-      </w:r>
-    </w:p>
-    <w:p>
-      <w:r>
-        <w:t>col-</w:t>
-      </w:r>
-      <w:proofErr w:type="spellStart"/>
-      <w:r>
-        <w:t>span</w:t>
-      </w:r>
-      <w:proofErr w:type="spellEnd"/>
-      <w:r>
-        <w:t xml:space="preserve">: </w:t>
-      </w:r>
-      <w:r>
-        <w:t>1</w:t>
-      </w:r>
-    </w:p>
-    <w:p>
-      <w:r>
-        <w:t xml:space="preserve">altura: </w:t>
-      </w:r>
-      <w:r>
-        <w:t>1</w:t>
-      </w:r>
-      <w:r>
-        <w:t xml:space="preserve"> </w:t>
-      </w:r>
-      <w:proofErr w:type="spellStart"/>
-      <w:r>
-        <w:t>linea</w:t>
-      </w:r>
-      <w:proofErr w:type="spellEnd"/>
-    </w:p>
-    <w:p/>
-    <w:p>
-      <w:r>
-        <w:t>2</w:t>
-      </w:r>
-      <w:r>
-        <w:t xml:space="preserve"> </w:t>
-      </w:r>
-      <w:r>
-        <w:t>Restaur</w:t>
-      </w:r>
-      <w:r>
-        <w:t>an</w:t>
-      </w:r>
-      <w:r>
-        <w:t>te-IMG_8187-2000</w:t>
-      </w:r>
-    </w:p>
-    <w:p>
-      <w:r>
-        <w:t xml:space="preserve">data-tags: </w:t>
-      </w:r>
-      <w:proofErr w:type="spellStart"/>
-      <w:r>
-        <w:t>areas</w:t>
-      </w:r>
-      <w:proofErr w:type="spellEnd"/>
-      <w:r>
-        <w:t xml:space="preserve"> </w:t>
-      </w:r>
-      <w:r>
-        <w:t>comunes</w:t>
-      </w:r>
-    </w:p>
-    <w:p>
-      <w:r>
-        <w:t>col-</w:t>
-      </w:r>
-      <w:proofErr w:type="spellStart"/>
-      <w:r>
-        <w:t>span</w:t>
-      </w:r>
-      <w:proofErr w:type="spellEnd"/>
-      <w:r>
-        <w:t xml:space="preserve">: </w:t>
-      </w:r>
-      <w:r>
-        <w:t>1</w:t>
-      </w:r>
-    </w:p>
-    <w:p>
-      <w:r>
-        <w:t xml:space="preserve">altura: 1 </w:t>
-      </w:r>
-      <w:proofErr w:type="spellStart"/>
-      <w:r>
-        <w:t>linea</w:t>
-      </w:r>
-      <w:proofErr w:type="spellEnd"/>
-    </w:p>
-    <w:p/>
-    <w:p>
-      <w:r>
-        <w:t>3</w:t>
-      </w:r>
-      <w:r>
-        <w:t xml:space="preserve"> </w:t>
-      </w:r>
-      <w:r>
-        <w:t>Desayuno-DIC23-2000</w:t>
-      </w:r>
-    </w:p>
-    <w:p>
-      <w:r>
-        <w:t xml:space="preserve">data-tags: </w:t>
-      </w:r>
-      <w:proofErr w:type="spellStart"/>
-      <w:r>
-        <w:t>areas</w:t>
-      </w:r>
-      <w:proofErr w:type="spellEnd"/>
-      <w:r>
-        <w:t xml:space="preserve"> comunes, desayuno</w:t>
-      </w:r>
-    </w:p>
-    <w:p>
-      <w:r>
-        <w:t>col-</w:t>
-      </w:r>
-      <w:proofErr w:type="spellStart"/>
-      <w:r>
-        <w:t>span</w:t>
-      </w:r>
-      <w:proofErr w:type="spellEnd"/>
-      <w:r>
-        <w:t>: 2</w:t>
-      </w:r>
-    </w:p>
-    <w:p>
-      <w:r>
-        <w:t xml:space="preserve">altura: 2 </w:t>
-      </w:r>
-      <w:proofErr w:type="spellStart"/>
-      <w:r>
-        <w:t>lineas</w:t>
-      </w:r>
-      <w:proofErr w:type="spellEnd"/>
-    </w:p>
-    <w:p/>
-    <w:p>
-      <w:r>
-        <w:t xml:space="preserve">4. </w:t>
-      </w:r>
-      <w:r>
-        <w:t>PaloSanto-Restaurante-ByN-IMG_2113-2000</w:t>
-      </w:r>
-    </w:p>
-    <w:p>
-      <w:r>
-        <w:t xml:space="preserve">data-tags: </w:t>
-      </w:r>
-      <w:proofErr w:type="spellStart"/>
-      <w:r>
-        <w:t>areas</w:t>
-      </w:r>
-      <w:proofErr w:type="spellEnd"/>
-      <w:r>
-        <w:t xml:space="preserve"> comunes, desayuno</w:t>
-      </w:r>
-    </w:p>
-    <w:p>
-      <w:r>
-        <w:t>col-</w:t>
-      </w:r>
-      <w:proofErr w:type="spellStart"/>
-      <w:r>
-        <w:t>span</w:t>
-      </w:r>
-      <w:proofErr w:type="spellEnd"/>
-      <w:r>
-        <w:t xml:space="preserve">: </w:t>
-      </w:r>
-      <w:r>
-        <w:t>1</w:t>
-      </w:r>
-    </w:p>
-    <w:p>
-      <w:r>
-        <w:t xml:space="preserve">altura: </w:t>
-      </w:r>
-      <w:r>
-        <w:t>2</w:t>
-      </w:r>
-      <w:r>
-        <w:t xml:space="preserve"> </w:t>
-      </w:r>
-      <w:proofErr w:type="spellStart"/>
-      <w:r>
-        <w:t>linea</w:t>
-      </w:r>
-      <w:r>
-        <w:t>s</w:t>
       </w:r>
       <w:proofErr w:type="spellEnd"/>
     </w:p>
@@ -1242,10 +1219,53 @@
         <w:t>2</w:t>
       </w:r>
       <w:r>
+        <w:t xml:space="preserve"> FachadaP-IMG_2480-205</w:t>
+      </w:r>
+    </w:p>
+    <w:p>
+      <w:r>
+        <w:t xml:space="preserve">data-tags: </w:t>
+      </w:r>
+      <w:r>
+        <w:t>exteriores</w:t>
+      </w:r>
+    </w:p>
+    <w:p>
+      <w:r>
+        <w:t>col-</w:t>
+      </w:r>
+      <w:proofErr w:type="spellStart"/>
+      <w:r>
+        <w:t>span</w:t>
+      </w:r>
+      <w:proofErr w:type="spellEnd"/>
+      <w:r>
+        <w:t xml:space="preserve">: </w:t>
+      </w:r>
+      <w:r>
+        <w:t>1</w:t>
+      </w:r>
+    </w:p>
+    <w:p>
+      <w:r>
+        <w:t xml:space="preserve">altura: 1 </w:t>
+      </w:r>
+      <w:proofErr w:type="spellStart"/>
+      <w:r>
+        <w:t>linea</w:t>
+      </w:r>
+      <w:proofErr w:type="spellEnd"/>
+    </w:p>
+    <w:p/>
+    <w:p>
+      <w:r>
+        <w:t>3</w:t>
+      </w:r>
+      <w:r>
         <w:t xml:space="preserve"> </w:t>
       </w:r>
       <w:r>
-        <w:t>FachadaP-IMG_2480-205</w:t>
+        <w:t>Rooftop_MG_3142</w:t>
       </w:r>
     </w:p>
     <w:p>
@@ -1253,56 +1273,7 @@
         <w:t xml:space="preserve">data-tags: </w:t>
       </w:r>
       <w:r>
-        <w:t>exteriores</w:t>
-      </w:r>
-    </w:p>
-    <w:p>
-      <w:r>
-        <w:t>col-</w:t>
-      </w:r>
-      <w:proofErr w:type="spellStart"/>
-      <w:r>
-        <w:t>span</w:t>
-      </w:r>
-      <w:proofErr w:type="spellEnd"/>
-      <w:r>
-        <w:t xml:space="preserve">: </w:t>
-      </w:r>
-      <w:r>
-        <w:t>1</w:t>
-      </w:r>
-    </w:p>
-    <w:p>
-      <w:r>
-        <w:t xml:space="preserve">altura: 1 </w:t>
-      </w:r>
-      <w:proofErr w:type="spellStart"/>
-      <w:r>
-        <w:t>linea</w:t>
-      </w:r>
-      <w:proofErr w:type="spellEnd"/>
-    </w:p>
-    <w:p/>
-    <w:p>
-      <w:r>
-        <w:t>3</w:t>
-      </w:r>
-      <w:r>
-        <w:t xml:space="preserve"> </w:t>
-      </w:r>
-      <w:r>
-        <w:t>Rooftop_MG_3142</w:t>
-      </w:r>
-    </w:p>
-    <w:p>
-      <w:r>
-        <w:t xml:space="preserve">data-tags: </w:t>
-      </w:r>
-      <w:r>
-        <w:t>exteriores</w:t>
-      </w:r>
-      <w:r>
-        <w:t xml:space="preserve">, servicios, </w:t>
+        <w:t xml:space="preserve">exteriores, servicios, </w:t>
       </w:r>
       <w:proofErr w:type="spellStart"/>
       <w:r>

</xml_diff>